<commit_message>
Add figures to answers doc
Co-Authored-By: Claude Opus 5.5 <noreply@anthropic.com>
Claude-Session: https://claude.ai/code/session_01KAw4W3VS31wfj9ZhywYngh
</commit_message>
<xml_diff>
--- a/superfund_pset/Superfund_answers.docx
+++ b/superfund_pset/Superfund_answers.docx
@@ -66,12 +66,44 @@
               <w:spacing w:after="120"/>
             </w:pPr>
             <w:r>
-              <w:rPr>
-                <w:i/>
-                <w:iCs/>
-                <w:color w:val="666666"/>
-              </w:rPr>
-              <w:t xml:space="preserve">[Insert histograms of house_price by year]</w:t>
+              <w:drawing>
+                <wp:inline distT="0" distB="0" distL="0" distR="0">
+                  <wp:extent cx="4343400" cy="3105150"/>
+                  <wp:effectExtent t="0" r="0" b="0" l="0"/>
+                  <wp:docPr id="1" name="" descr="" title=""/>
+                  <wp:cNvGraphicFramePr>
+                    <a:graphicFrameLocks xmlns:a="http://schemas.openxmlformats.org/drawingml/2006/main" noChangeAspect="1"/>
+                  </wp:cNvGraphicFramePr>
+                  <a:graphic xmlns:a="http://schemas.openxmlformats.org/drawingml/2006/main">
+                    <a:graphicData uri="http://schemas.openxmlformats.org/drawingml/2006/picture">
+                      <pic:pic xmlns:pic="http://schemas.openxmlformats.org/drawingml/2006/picture">
+                        <pic:nvPicPr>
+                          <pic:cNvPr id="0" name="" descr=""/>
+                          <pic:cNvPicPr>
+                            <a:picLocks noChangeAspect="1" noChangeArrowheads="1"/>
+                          </pic:cNvPicPr>
+                        </pic:nvPicPr>
+                        <pic:blipFill>
+                          <a:blip r:embed="rId7" cstate="none"/>
+                          <a:srcRect/>
+                          <a:stretch>
+                            <a:fillRect/>
+                          </a:stretch>
+                        </pic:blipFill>
+                        <pic:spPr bwMode="auto">
+                          <a:xfrm>
+                            <a:off x="0" y="0"/>
+                            <a:ext cx="4343400" cy="3105150"/>
+                          </a:xfrm>
+                          <a:prstGeom prst="rect">
+                            <a:avLst/>
+                          </a:prstGeom>
+                        </pic:spPr>
+                      </pic:pic>
+                    </a:graphicData>
+                  </a:graphic>
+                </wp:inline>
+              </w:drawing>
             </w:r>
           </w:p>
         </w:tc>
@@ -199,12 +231,44 @@
               <w:spacing w:after="120"/>
             </w:pPr>
             <w:r>
-              <w:rPr>
-                <w:i/>
-                <w:iCs/>
-                <w:color w:val="666666"/>
-              </w:rPr>
-              <w:t xml:space="preserve">[Insert histograms after cleaning]</w:t>
+              <w:drawing>
+                <wp:inline distT="0" distB="0" distL="0" distR="0">
+                  <wp:extent cx="4343400" cy="3105150"/>
+                  <wp:effectExtent t="0" r="0" b="0" l="0"/>
+                  <wp:docPr id="1" name="" descr="" title=""/>
+                  <wp:cNvGraphicFramePr>
+                    <a:graphicFrameLocks xmlns:a="http://schemas.openxmlformats.org/drawingml/2006/main" noChangeAspect="1"/>
+                  </wp:cNvGraphicFramePr>
+                  <a:graphic xmlns:a="http://schemas.openxmlformats.org/drawingml/2006/main">
+                    <a:graphicData uri="http://schemas.openxmlformats.org/drawingml/2006/picture">
+                      <pic:pic xmlns:pic="http://schemas.openxmlformats.org/drawingml/2006/picture">
+                        <pic:nvPicPr>
+                          <pic:cNvPr id="0" name="" descr=""/>
+                          <pic:cNvPicPr>
+                            <a:picLocks noChangeAspect="1" noChangeArrowheads="1"/>
+                          </pic:cNvPicPr>
+                        </pic:nvPicPr>
+                        <pic:blipFill>
+                          <a:blip r:embed="rId8" cstate="none"/>
+                          <a:srcRect/>
+                          <a:stretch>
+                            <a:fillRect/>
+                          </a:stretch>
+                        </pic:blipFill>
+                        <pic:spPr bwMode="auto">
+                          <a:xfrm>
+                            <a:off x="0" y="0"/>
+                            <a:ext cx="4343400" cy="3105150"/>
+                          </a:xfrm>
+                          <a:prstGeom prst="rect">
+                            <a:avLst/>
+                          </a:prstGeom>
+                        </pic:spPr>
+                      </pic:pic>
+                    </a:graphicData>
+                  </a:graphic>
+                </wp:inline>
+              </w:drawing>
             </w:r>
           </w:p>
         </w:tc>
@@ -263,19 +327,6 @@
               <w:t xml:space="preserve">α = -0.143 (robust SE = 0.020), constant = 10.87, N = 48,367.</w:t>
             </w:r>
           </w:p>
-          <w:p>
-            <w:pPr>
-              <w:spacing w:after="120"/>
-            </w:pPr>
-            <w:r>
-              <w:rPr>
-                <w:i/>
-                <w:iCs/>
-                <w:color w:val="666666"/>
-              </w:rPr>
-              <w:t xml:space="preserve">[Paste summary(reg_cross) output]</w:t>
-            </w:r>
-          </w:p>
         </w:tc>
       </w:tr>
     </w:tbl>
@@ -681,25 +732,89 @@
               <w:spacing w:after="120"/>
             </w:pPr>
             <w:r>
-              <w:rPr>
-                <w:i/>
-                <w:iCs/>
-                <w:color w:val="666666"/>
-              </w:rPr>
-              <w:t xml:space="preserve">[Insert raw averages plot, sample (i)]</w:t>
-            </w:r>
-          </w:p>
-          <w:p>
-            <w:pPr>
-              <w:spacing w:after="120"/>
-            </w:pPr>
-            <w:r>
-              <w:rPr>
-                <w:i/>
-                <w:iCs/>
-                <w:color w:val="666666"/>
-              </w:rPr>
-              <w:t xml:space="preserve">[Insert event study plot, sample (i)]</w:t>
+              <w:drawing>
+                <wp:inline distT="0" distB="0" distL="0" distR="0">
+                  <wp:extent cx="4343400" cy="3105150"/>
+                  <wp:effectExtent t="0" r="0" b="0" l="0"/>
+                  <wp:docPr id="1" name="" descr="" title=""/>
+                  <wp:cNvGraphicFramePr>
+                    <a:graphicFrameLocks xmlns:a="http://schemas.openxmlformats.org/drawingml/2006/main" noChangeAspect="1"/>
+                  </wp:cNvGraphicFramePr>
+                  <a:graphic xmlns:a="http://schemas.openxmlformats.org/drawingml/2006/main">
+                    <a:graphicData uri="http://schemas.openxmlformats.org/drawingml/2006/picture">
+                      <pic:pic xmlns:pic="http://schemas.openxmlformats.org/drawingml/2006/picture">
+                        <pic:nvPicPr>
+                          <pic:cNvPr id="0" name="" descr=""/>
+                          <pic:cNvPicPr>
+                            <a:picLocks noChangeAspect="1" noChangeArrowheads="1"/>
+                          </pic:cNvPicPr>
+                        </pic:nvPicPr>
+                        <pic:blipFill>
+                          <a:blip r:embed="rId9" cstate="none"/>
+                          <a:srcRect/>
+                          <a:stretch>
+                            <a:fillRect/>
+                          </a:stretch>
+                        </pic:blipFill>
+                        <pic:spPr bwMode="auto">
+                          <a:xfrm>
+                            <a:off x="0" y="0"/>
+                            <a:ext cx="4343400" cy="3105150"/>
+                          </a:xfrm>
+                          <a:prstGeom prst="rect">
+                            <a:avLst/>
+                          </a:prstGeom>
+                        </pic:spPr>
+                      </pic:pic>
+                    </a:graphicData>
+                  </a:graphic>
+                </wp:inline>
+              </w:drawing>
+            </w:r>
+          </w:p>
+          <w:p>
+            <w:pPr>
+              <w:spacing w:after="120"/>
+            </w:pPr>
+            <w:r>
+              <w:drawing>
+                <wp:inline distT="0" distB="0" distL="0" distR="0">
+                  <wp:extent cx="4343400" cy="3105150"/>
+                  <wp:effectExtent t="0" r="0" b="0" l="0"/>
+                  <wp:docPr id="1" name="" descr="" title=""/>
+                  <wp:cNvGraphicFramePr>
+                    <a:graphicFrameLocks xmlns:a="http://schemas.openxmlformats.org/drawingml/2006/main" noChangeAspect="1"/>
+                  </wp:cNvGraphicFramePr>
+                  <a:graphic xmlns:a="http://schemas.openxmlformats.org/drawingml/2006/main">
+                    <a:graphicData uri="http://schemas.openxmlformats.org/drawingml/2006/picture">
+                      <pic:pic xmlns:pic="http://schemas.openxmlformats.org/drawingml/2006/picture">
+                        <pic:nvPicPr>
+                          <pic:cNvPr id="0" name="" descr=""/>
+                          <pic:cNvPicPr>
+                            <a:picLocks noChangeAspect="1" noChangeArrowheads="1"/>
+                          </pic:cNvPicPr>
+                        </pic:nvPicPr>
+                        <pic:blipFill>
+                          <a:blip r:embed="rId10" cstate="none"/>
+                          <a:srcRect/>
+                          <a:stretch>
+                            <a:fillRect/>
+                          </a:stretch>
+                        </pic:blipFill>
+                        <pic:spPr bwMode="auto">
+                          <a:xfrm>
+                            <a:off x="0" y="0"/>
+                            <a:ext cx="4343400" cy="3105150"/>
+                          </a:xfrm>
+                          <a:prstGeom prst="rect">
+                            <a:avLst/>
+                          </a:prstGeom>
+                        </pic:spPr>
+                      </pic:pic>
+                    </a:graphicData>
+                  </a:graphic>
+                </wp:inline>
+              </w:drawing>
             </w:r>
           </w:p>
           <w:p>
@@ -715,25 +830,89 @@
               <w:spacing w:after="120"/>
             </w:pPr>
             <w:r>
-              <w:rPr>
-                <w:i/>
-                <w:iCs/>
-                <w:color w:val="666666"/>
-              </w:rPr>
-              <w:t xml:space="preserve">[Insert raw averages plot, sample (ii)]</w:t>
-            </w:r>
-          </w:p>
-          <w:p>
-            <w:pPr>
-              <w:spacing w:after="120"/>
-            </w:pPr>
-            <w:r>
-              <w:rPr>
-                <w:i/>
-                <w:iCs/>
-                <w:color w:val="666666"/>
-              </w:rPr>
-              <w:t xml:space="preserve">[Insert event study plot, sample (ii)]</w:t>
+              <w:drawing>
+                <wp:inline distT="0" distB="0" distL="0" distR="0">
+                  <wp:extent cx="4343400" cy="3105150"/>
+                  <wp:effectExtent t="0" r="0" b="0" l="0"/>
+                  <wp:docPr id="1" name="" descr="" title=""/>
+                  <wp:cNvGraphicFramePr>
+                    <a:graphicFrameLocks xmlns:a="http://schemas.openxmlformats.org/drawingml/2006/main" noChangeAspect="1"/>
+                  </wp:cNvGraphicFramePr>
+                  <a:graphic xmlns:a="http://schemas.openxmlformats.org/drawingml/2006/main">
+                    <a:graphicData uri="http://schemas.openxmlformats.org/drawingml/2006/picture">
+                      <pic:pic xmlns:pic="http://schemas.openxmlformats.org/drawingml/2006/picture">
+                        <pic:nvPicPr>
+                          <pic:cNvPr id="0" name="" descr=""/>
+                          <pic:cNvPicPr>
+                            <a:picLocks noChangeAspect="1" noChangeArrowheads="1"/>
+                          </pic:cNvPicPr>
+                        </pic:nvPicPr>
+                        <pic:blipFill>
+                          <a:blip r:embed="rId11" cstate="none"/>
+                          <a:srcRect/>
+                          <a:stretch>
+                            <a:fillRect/>
+                          </a:stretch>
+                        </pic:blipFill>
+                        <pic:spPr bwMode="auto">
+                          <a:xfrm>
+                            <a:off x="0" y="0"/>
+                            <a:ext cx="4343400" cy="3105150"/>
+                          </a:xfrm>
+                          <a:prstGeom prst="rect">
+                            <a:avLst/>
+                          </a:prstGeom>
+                        </pic:spPr>
+                      </pic:pic>
+                    </a:graphicData>
+                  </a:graphic>
+                </wp:inline>
+              </w:drawing>
+            </w:r>
+          </w:p>
+          <w:p>
+            <w:pPr>
+              <w:spacing w:after="120"/>
+            </w:pPr>
+            <w:r>
+              <w:drawing>
+                <wp:inline distT="0" distB="0" distL="0" distR="0">
+                  <wp:extent cx="4343400" cy="3105150"/>
+                  <wp:effectExtent t="0" r="0" b="0" l="0"/>
+                  <wp:docPr id="1" name="" descr="" title=""/>
+                  <wp:cNvGraphicFramePr>
+                    <a:graphicFrameLocks xmlns:a="http://schemas.openxmlformats.org/drawingml/2006/main" noChangeAspect="1"/>
+                  </wp:cNvGraphicFramePr>
+                  <a:graphic xmlns:a="http://schemas.openxmlformats.org/drawingml/2006/main">
+                    <a:graphicData uri="http://schemas.openxmlformats.org/drawingml/2006/picture">
+                      <pic:pic xmlns:pic="http://schemas.openxmlformats.org/drawingml/2006/picture">
+                        <pic:nvPicPr>
+                          <pic:cNvPr id="0" name="" descr=""/>
+                          <pic:cNvPicPr>
+                            <a:picLocks noChangeAspect="1" noChangeArrowheads="1"/>
+                          </pic:cNvPicPr>
+                        </pic:nvPicPr>
+                        <pic:blipFill>
+                          <a:blip r:embed="rId12" cstate="none"/>
+                          <a:srcRect/>
+                          <a:stretch>
+                            <a:fillRect/>
+                          </a:stretch>
+                        </pic:blipFill>
+                        <pic:spPr bwMode="auto">
+                          <a:xfrm>
+                            <a:off x="0" y="0"/>
+                            <a:ext cx="4343400" cy="3105150"/>
+                          </a:xfrm>
+                          <a:prstGeom prst="rect">
+                            <a:avLst/>
+                          </a:prstGeom>
+                        </pic:spPr>
+                      </pic:pic>
+                    </a:graphicData>
+                  </a:graphic>
+                </wp:inline>
+              </w:drawing>
             </w:r>
           </w:p>
         </w:tc>
@@ -909,19 +1088,6 @@
               <w:spacing w:after="120"/>
             </w:pPr>
             <w:r>
-              <w:rPr>
-                <w:i/>
-                <w:iCs/>
-                <w:color w:val="666666"/>
-              </w:rPr>
-              <w:t xml:space="preserve">[Paste etable(did) output]</w:t>
-            </w:r>
-          </w:p>
-          <w:p>
-            <w:pPr>
-              <w:spacing w:after="120"/>
-            </w:pPr>
-            <w:r>
               <w:t xml:space="preserve">After 1982, house prices in tracts placed on the NPL changed by about -5% relative to tracts just below the cutoff, but this isn't statistically significant (p = 0.27). With 95% confidence, we can rule out a price increase bigger than about 4% and a price decrease bigger than about 14%.</w:t>
             </w:r>
           </w:p>
@@ -978,12 +1144,44 @@
               <w:spacing w:after="120"/>
             </w:pPr>
             <w:r>
-              <w:rPr>
-                <w:i/>
-                <w:iCs/>
-                <w:color w:val="666666"/>
-              </w:rPr>
-              <w:t xml:space="preserve">[Insert event study plot, log(housing_units)]</w:t>
+              <w:drawing>
+                <wp:inline distT="0" distB="0" distL="0" distR="0">
+                  <wp:extent cx="4343400" cy="3105150"/>
+                  <wp:effectExtent t="0" r="0" b="0" l="0"/>
+                  <wp:docPr id="1" name="" descr="" title=""/>
+                  <wp:cNvGraphicFramePr>
+                    <a:graphicFrameLocks xmlns:a="http://schemas.openxmlformats.org/drawingml/2006/main" noChangeAspect="1"/>
+                  </wp:cNvGraphicFramePr>
+                  <a:graphic xmlns:a="http://schemas.openxmlformats.org/drawingml/2006/main">
+                    <a:graphicData uri="http://schemas.openxmlformats.org/drawingml/2006/picture">
+                      <pic:pic xmlns:pic="http://schemas.openxmlformats.org/drawingml/2006/picture">
+                        <pic:nvPicPr>
+                          <pic:cNvPr id="0" name="" descr=""/>
+                          <pic:cNvPicPr>
+                            <a:picLocks noChangeAspect="1" noChangeArrowheads="1"/>
+                          </pic:cNvPicPr>
+                        </pic:nvPicPr>
+                        <pic:blipFill>
+                          <a:blip r:embed="rId13" cstate="none"/>
+                          <a:srcRect/>
+                          <a:stretch>
+                            <a:fillRect/>
+                          </a:stretch>
+                        </pic:blipFill>
+                        <pic:spPr bwMode="auto">
+                          <a:xfrm>
+                            <a:off x="0" y="0"/>
+                            <a:ext cx="4343400" cy="3105150"/>
+                          </a:xfrm>
+                          <a:prstGeom prst="rect">
+                            <a:avLst/>
+                          </a:prstGeom>
+                        </pic:spPr>
+                      </pic:pic>
+                    </a:graphicData>
+                  </a:graphic>
+                </wp:inline>
+              </w:drawing>
             </w:r>
           </w:p>
           <w:p>

</xml_diff>

<commit_message>
Fix wording errors in answers doc (1B, 3F, 3H)
Co-Authored-By: Claude Opus 5.5 <noreply@anthropic.com>
Claude-Session: https://claude.ai/code/session_01KAw4W3VS31wfj9ZhywYngh
</commit_message>
<xml_diff>
--- a/superfund_pset/Superfund_answers.docx
+++ b/superfund_pset/Superfund_answers.docx
@@ -159,7 +159,7 @@
               <w:spacing w:after="120"/>
             </w:pPr>
             <w:r>
-              <w:t xml:space="preserve">Yes. 1970, 1990, and 2000 look reasonable, but 1980 has two problems. First, 3,757 tracts have a house price of $0, which isn't possible, so these are really missing values. Second, there are some huge values: the max is about $70 million and 90 tracts are over $1 million, even though most 1980 prices are under $200,000. The 1980 Census top-coded home values, so a tract average above about $250,000 can't be real. I think both of these are data errors.</w:t>
+              <w:t xml:space="preserve">Yes. 1990 and 2000 look reasonable, but 1980 has two problems (and 1970 has a smaller version of the first one). First, 3,757 tracts in 1980 (and 39 in 1970) have a house price of $0, which isn't possible, so these are really missing values. Second, there are some huge values in 1980: the max is about $70 million and 90 tracts are over $1 million, even though 99% of 1980 prices are under $200,000 and the highest 1970 price is about $90,000. A tract average in the millions isn't believable for 1980, and there's a clear cluster right at $250,000 that looks like a top-code, so I treated anything above that as an error. I think both of these are data errors.</w:t>
             </w:r>
           </w:p>
           <w:p>
@@ -968,7 +968,7 @@
               <w:spacing w:after="120"/>
             </w:pPr>
             <w:r>
-              <w:t xml:space="preserve">τ1970 is the treatment-control difference in 1970 compared to 1980, before anyone knew which sites would be listed. In sample (i) it's -0.056, meaning treated tracts were already catching up to control tracts before treatment, which suggests a pre-trend. In sample (ii) it's 0.017, basically zero, so the two groups were on similar paths before 1982. That makes it more plausible that τ1990 is unbiased in sample (ii).</w:t>
+              <w:t xml:space="preserve">τ1970 is the treatment-control difference in 1970 compared to 1980, before anyone knew which sites would be listed. In sample (i) it's -0.056, meaning treated tracts' prices were already growing faster than control tracts' between 1970 and 1980, before treatment. That's a pre-trend. In sample (ii) it's 0.017, basically zero, so the two groups were on similar paths before 1982. That makes it more plausible that τ1990 is unbiased in sample (ii).</w:t>
             </w:r>
           </w:p>
         </w:tc>
@@ -1088,7 +1088,7 @@
               <w:spacing w:after="120"/>
             </w:pPr>
             <w:r>
-              <w:t xml:space="preserve">After 1982, house prices in tracts placed on the NPL changed by about -5% relative to tracts just below the cutoff, but this isn't statistically significant (p = 0.27). With 95% confidence, we can rule out a price increase bigger than about 4% and a price decrease bigger than about 14%.</w:t>
+              <w:t xml:space="preserve">After 1982, house prices in tracts placed on the NPL changed by about -5% relative to tracts just below the cutoff, but this isn't statistically significant (p = 0.27). With 95% confidence, we can rule out a price increase bigger than about 4% and a price decrease bigger than about 13%.</w:t>
             </w:r>
           </w:p>
         </w:tc>

</xml_diff>